<commit_message>
feat: simplify product submission and add walkthrough
</commit_message>
<xml_diff>
--- a/artifacts/MIST_App_Showcase_Workflow_Journey.docx
+++ b/artifacts/MIST_App_Showcase_Workflow_Journey.docx
@@ -98,7 +98,7 @@
       <w:r>
         <w:drawing>
           <wp:inline xmlns:a="http://schemas.openxmlformats.org/drawingml/2006/main" xmlns:pic="http://schemas.openxmlformats.org/drawingml/2006/picture">
-            <wp:extent cx="5669280" cy="3283159"/>
+            <wp:extent cx="5669280" cy="3282513"/>
             <wp:docPr id="2" name="Picture 2" descr="MIST sign-in screen with the MIST logo, Account ID and Password fields, account request option and product principles." title="Secure access is the first step: structured requests, visible progress and named human decisions."/>
             <wp:cNvGraphicFramePr>
               <a:graphicFrameLocks noChangeAspect="1"/>
@@ -107,7 +107,7 @@
               <a:graphicData uri="http://schemas.openxmlformats.org/drawingml/2006/picture">
                 <pic:pic>
                   <pic:nvPicPr>
-                    <pic:cNvPr id="0" name="01-login.png"/>
+                    <pic:cNvPr id="0" name="01-login.jpg"/>
                     <pic:cNvPicPr/>
                   </pic:nvPicPr>
                   <pic:blipFill>
@@ -119,7 +119,7 @@
                   <pic:spPr>
                     <a:xfrm>
                       <a:off x="0" y="0"/>
-                      <a:ext cx="5669280" cy="3283159"/>
+                      <a:ext cx="5669280" cy="3282513"/>
                     </a:xfrm>
                     <a:prstGeom prst="rect"/>
                   </pic:spPr>
@@ -177,7 +177,7 @@
           <w:color w:val="5B6573"/>
           <w:sz w:val="17"/>
         </w:rPr>
-        <w:t>Prepared from latest main at commit 42533e2 | 17 August 2026 | Synthetic demonstration</w:t>
+        <w:t>Prepared from the current MIST application build | 17 August 2026 | Synthetic demonstration</w:t>
       </w:r>
     </w:p>
     <w:p>
@@ -1323,7 +1323,7 @@
       <w:r>
         <w:drawing>
           <wp:inline xmlns:a="http://schemas.openxmlformats.org/drawingml/2006/main" xmlns:pic="http://schemas.openxmlformats.org/drawingml/2006/picture">
-            <wp:extent cx="5623560" cy="3165198"/>
+            <wp:extent cx="5623560" cy="3166064"/>
             <wp:docPr id="3" name="Picture 3" descr="Completed MIST new service request form showing the four progress sections and example Northshore request fields." title="The Customer intake form is organised into The need, Scope and purpose, Product expectations, and Supporting information and handling."/>
             <wp:cNvGraphicFramePr>
               <a:graphicFrameLocks noChangeAspect="1"/>
@@ -1332,7 +1332,7 @@
               <a:graphicData uri="http://schemas.openxmlformats.org/drawingml/2006/picture">
                 <pic:pic>
                   <pic:nvPicPr>
-                    <pic:cNvPr id="0" name="03-customer-new-request.png"/>
+                    <pic:cNvPr id="0" name="03-customer-new-request.jpg"/>
                     <pic:cNvPicPr/>
                   </pic:nvPicPr>
                   <pic:blipFill>
@@ -1344,7 +1344,7 @@
                   <pic:spPr>
                     <a:xfrm>
                       <a:off x="0" y="0"/>
-                      <a:ext cx="5623560" cy="3165198"/>
+                      <a:ext cx="5623560" cy="3166064"/>
                     </a:xfrm>
                     <a:prstGeom prst="rect"/>
                   </pic:spPr>
@@ -1489,7 +1489,7 @@
       <w:r>
         <w:drawing>
           <wp:inline xmlns:a="http://schemas.openxmlformats.org/drawingml/2006/main" xmlns:pic="http://schemas.openxmlformats.org/drawingml/2006/picture">
-            <wp:extent cx="5623560" cy="3165198"/>
+            <wp:extent cx="5623560" cy="3166064"/>
             <wp:docPr id="4" name="Picture 4" descr="Customer request detail page for the Northshore request showing its reference, JIOC routing status, progress stages and request details." title="SR-2026-57131D5B is now visible to the Customer with a seven-stage progress indicator and JIOC as current owner."/>
             <wp:cNvGraphicFramePr>
               <a:graphicFrameLocks noChangeAspect="1"/>
@@ -1498,7 +1498,7 @@
               <a:graphicData uri="http://schemas.openxmlformats.org/drawingml/2006/picture">
                 <pic:pic>
                   <pic:nvPicPr>
-                    <pic:cNvPr id="0" name="04-customer-submitted.png"/>
+                    <pic:cNvPr id="0" name="04-customer-submitted.jpg"/>
                     <pic:cNvPicPr/>
                   </pic:nvPicPr>
                   <pic:blipFill>
@@ -1510,7 +1510,7 @@
                   <pic:spPr>
                     <a:xfrm>
                       <a:off x="0" y="0"/>
-                      <a:ext cx="5623560" cy="3165198"/>
+                      <a:ext cx="5623560" cy="3166064"/>
                     </a:xfrm>
                     <a:prstGeom prst="rect"/>
                   </pic:spPr>
@@ -1655,7 +1655,7 @@
       <w:r>
         <w:drawing>
           <wp:inline xmlns:a="http://schemas.openxmlformats.org/drawingml/2006/main" xmlns:pic="http://schemas.openxmlformats.org/drawingml/2006/picture">
-            <wp:extent cx="5623560" cy="3165198"/>
+            <wp:extent cx="5623560" cy="3166064"/>
             <wp:docPr id="5" name="Picture 5" descr="JIOC routing screen showing Route to command, DIGOC as destination and the selected route path." title="Scott McTominay routes the request from JIOC to DIGOC and records its priority."/>
             <wp:cNvGraphicFramePr>
               <a:graphicFrameLocks noChangeAspect="1"/>
@@ -1664,7 +1664,7 @@
               <a:graphicData uri="http://schemas.openxmlformats.org/drawingml/2006/picture">
                 <pic:pic>
                   <pic:nvPicPr>
-                    <pic:cNvPr id="0" name="05-jioc-routing.png"/>
+                    <pic:cNvPr id="0" name="05-jioc-routing.jpg"/>
                     <pic:cNvPicPr/>
                   </pic:nvPicPr>
                   <pic:blipFill>
@@ -1676,7 +1676,7 @@
                   <pic:spPr>
                     <a:xfrm>
                       <a:off x="0" y="0"/>
-                      <a:ext cx="5623560" cy="3165198"/>
+                      <a:ext cx="5623560" cy="3166064"/>
                     </a:xfrm>
                     <a:prstGeom prst="rect"/>
                   </pic:spPr>
@@ -1821,7 +1821,7 @@
       <w:r>
         <w:drawing>
           <wp:inline xmlns:a="http://schemas.openxmlformats.org/drawingml/2006/main" xmlns:pic="http://schemas.openxmlformats.org/drawingml/2006/picture">
-            <wp:extent cx="5623560" cy="3165198"/>
+            <wp:extent cx="5623560" cy="3166064"/>
             <wp:docPr id="6" name="Picture 6" descr="DIGOC request coordination screen showing Route to Ops group and NCGI-A Ops as the selected destination." title="Callum McGregor selects NCGI-A Ops from DIGOC's valid child units and records the routing note."/>
             <wp:cNvGraphicFramePr>
               <a:graphicFrameLocks noChangeAspect="1"/>
@@ -1830,7 +1830,7 @@
               <a:graphicData uri="http://schemas.openxmlformats.org/drawingml/2006/picture">
                 <pic:pic>
                   <pic:nvPicPr>
-                    <pic:cNvPr id="0" name="06-digoc-coordination.png"/>
+                    <pic:cNvPr id="0" name="06-digoc-coordination.jpg"/>
                     <pic:cNvPicPr/>
                   </pic:nvPicPr>
                   <pic:blipFill>
@@ -1842,7 +1842,7 @@
                   <pic:spPr>
                     <a:xfrm>
                       <a:off x="0" y="0"/>
-                      <a:ext cx="5623560" cy="3165198"/>
+                      <a:ext cx="5623560" cy="3166064"/>
                     </a:xfrm>
                     <a:prstGeom prst="rect"/>
                   </pic:spPr>
@@ -1987,7 +1987,7 @@
       <w:r>
         <w:drawing>
           <wp:inline xmlns:a="http://schemas.openxmlformats.org/drawingml/2006/main" xmlns:pic="http://schemas.openxmlformats.org/drawingml/2006/picture">
-            <wp:extent cx="5623560" cy="3165198"/>
+            <wp:extent cx="5623560" cy="3166064"/>
             <wp:docPr id="7" name="Picture 7" descr="Ops routing screen showing the JIOC to DIGOC to NCGI-A Ops path, OSG Team destination and required capabilities field." title="Kieran Tierney routes the work from NCGI-A Ops to the staffed OSG Team."/>
             <wp:cNvGraphicFramePr>
               <a:graphicFrameLocks noChangeAspect="1"/>
@@ -1996,7 +1996,7 @@
               <a:graphicData uri="http://schemas.openxmlformats.org/drawingml/2006/picture">
                 <pic:pic>
                   <pic:nvPicPr>
-                    <pic:cNvPr id="0" name="07-ncgi-ops-routing.png"/>
+                    <pic:cNvPr id="0" name="07-ncgi-ops-routing.jpg"/>
                     <pic:cNvPicPr/>
                   </pic:nvPicPr>
                   <pic:blipFill>
@@ -2008,7 +2008,7 @@
                   <pic:spPr>
                     <a:xfrm>
                       <a:off x="0" y="0"/>
-                      <a:ext cx="5623560" cy="3165198"/>
+                      <a:ext cx="5623560" cy="3166064"/>
                     </a:xfrm>
                     <a:prstGeom prst="rect"/>
                   </pic:spPr>
@@ -2153,7 +2153,7 @@
       <w:r>
         <w:drawing>
           <wp:inline xmlns:a="http://schemas.openxmlformats.org/drawingml/2006/main" xmlns:pic="http://schemas.openxmlformats.org/drawingml/2006/picture">
-            <wp:extent cx="5623560" cy="3165198"/>
+            <wp:extent cx="5623560" cy="3166064"/>
             <wp:docPr id="8" name="Picture 8" descr="OSG Team assignment screen showing Ben Doak as Lead Analyst and optional contributing analyst choices." title="Grant Hanley assigns Ben Doak as Lead Analyst for the Northshore service product."/>
             <wp:cNvGraphicFramePr>
               <a:graphicFrameLocks noChangeAspect="1"/>
@@ -2162,7 +2162,7 @@
               <a:graphicData uri="http://schemas.openxmlformats.org/drawingml/2006/picture">
                 <pic:pic>
                   <pic:nvPicPr>
-                    <pic:cNvPr id="0" name="08-osg-manager-assignment.png"/>
+                    <pic:cNvPr id="0" name="08-osg-manager-assignment.jpg"/>
                     <pic:cNvPicPr/>
                   </pic:nvPicPr>
                   <pic:blipFill>
@@ -2174,7 +2174,7 @@
                   <pic:spPr>
                     <a:xfrm>
                       <a:off x="0" y="0"/>
-                      <a:ext cx="5623560" cy="3165198"/>
+                      <a:ext cx="5623560" cy="3166064"/>
                     </a:xfrm>
                     <a:prstGeom prst="rect"/>
                   </pic:spPr>
@@ -2319,7 +2319,7 @@
       <w:r>
         <w:drawing>
           <wp:inline xmlns:a="http://schemas.openxmlformats.org/drawingml/2006/main" xmlns:pic="http://schemas.openxmlformats.org/drawingml/2006/picture">
-            <wp:extent cx="5623560" cy="3165198"/>
+            <wp:extent cx="5623560" cy="3166064"/>
             <wp:docPr id="9" name="Picture 9" descr="OSG Analyst production queue with Ask Customer for information selected and a fictional clarification question entered." title="The clarification task pauses production and returns the Customer's answer to the same Analyst assignment."/>
             <wp:cNvGraphicFramePr>
               <a:graphicFrameLocks noChangeAspect="1"/>
@@ -2328,7 +2328,7 @@
               <a:graphicData uri="http://schemas.openxmlformats.org/drawingml/2006/picture">
                 <pic:pic>
                   <pic:nvPicPr>
-                    <pic:cNvPr id="0" name="09-osg-analyst-clarification-option.png"/>
+                    <pic:cNvPr id="0" name="09-osg-analyst-clarification-option.jpg"/>
                     <pic:cNvPicPr/>
                   </pic:nvPicPr>
                   <pic:blipFill>
@@ -2340,7 +2340,7 @@
                   <pic:spPr>
                     <a:xfrm>
                       <a:off x="0" y="0"/>
-                      <a:ext cx="5623560" cy="3165198"/>
+                      <a:ext cx="5623560" cy="3166064"/>
                     </a:xfrm>
                     <a:prstGeom prst="rect"/>
                   </pic:spPr>
@@ -2473,7 +2473,7 @@
           <w:color w:val="5B6573"/>
           <w:sz w:val="23"/>
         </w:rPr>
-        <w:t>The Analyst assembles a versioned package, adds managed artefacts or approved links, writes the Customer covering note and submits the exact version for review.</w:t>
+        <w:t>The Analyst first chooses Upload product to MIST or Add a product link. MIST then shows only the relevant fields before one clear Submit product action.</w:t>
       </w:r>
     </w:p>
     <w:p>
@@ -2485,8 +2485,8 @@
       <w:r>
         <w:drawing>
           <wp:inline xmlns:a="http://schemas.openxmlformats.org/drawingml/2006/main" xmlns:pic="http://schemas.openxmlformats.org/drawingml/2006/picture">
-            <wp:extent cx="5623560" cy="3165198"/>
-            <wp:docPr id="10" name="Picture 10" descr="MIST package builder showing a scanned PNG ready for review, external link controls, covering note and submit exact version button." title="The package contains one scanned artefact and a Customer-facing note, ready to be bound to an immutable checksum."/>
+            <wp:extent cx="5623560" cy="3514725"/>
+            <wp:docPr id="10" name="Picture 10" descr="MIST package builder showing the selected Upload product to MIST route, its managed-file fields, the Customer covering note and the final Submit product action." title="The source selector removes competing forms: the Analyst chooses one route, adds the product and then submits the package for review."/>
             <wp:cNvGraphicFramePr>
               <a:graphicFrameLocks noChangeAspect="1"/>
             </wp:cNvGraphicFramePr>
@@ -2494,7 +2494,7 @@
               <a:graphicData uri="http://schemas.openxmlformats.org/drawingml/2006/picture">
                 <pic:pic>
                   <pic:nvPicPr>
-                    <pic:cNvPr id="0" name="10-osg-analyst-package.png"/>
+                    <pic:cNvPr id="0" name="10-osg-analyst-package.jpg"/>
                     <pic:cNvPicPr/>
                   </pic:nvPicPr>
                   <pic:blipFill>
@@ -2506,7 +2506,7 @@
                   <pic:spPr>
                     <a:xfrm>
                       <a:off x="0" y="0"/>
-                      <a:ext cx="5623560" cy="3165198"/>
+                      <a:ext cx="5623560" cy="3514725"/>
                     </a:xfrm>
                     <a:prstGeom prst="rect"/>
                   </pic:spPr>
@@ -2523,7 +2523,7 @@
         <w:jc w:val="center"/>
       </w:pPr>
       <w:r>
-        <w:t>The package contains one scanned artefact and a Customer-facing note, ready to be bound to an immutable checksum.</w:t>
+        <w:t>The source selector removes competing forms: the Analyst chooses one route, adds the product and then submits the package for review.</w:t>
       </w:r>
     </w:p>
     <w:p>
@@ -2537,7 +2537,7 @@
           <w:color w:val="0B2545"/>
           <w:sz w:val="20"/>
         </w:rPr>
-        <w:t xml:space="preserve">Managed files: </w:t>
+        <w:t xml:space="preserve">Upload to MIST: </w:t>
       </w:r>
       <w:r>
         <w:rPr>
@@ -2545,7 +2545,7 @@
           <w:color w:val="172B3A"/>
           <w:sz w:val="20"/>
         </w:rPr>
-        <w:t>PDF, Word, PowerPoint, PNG and JPEG artefacts are supported, up to ten per package, and must pass validation and malware scanning.</w:t>
+        <w:t>PDF, Word, PowerPoint, PNG and JPEG products are supported, up to ten per package, and must pass validation and malware scanning.</w:t>
       </w:r>
     </w:p>
     <w:p>
@@ -2559,7 +2559,7 @@
           <w:color w:val="0B2545"/>
           <w:sz w:val="20"/>
         </w:rPr>
-        <w:t xml:space="preserve">External products: </w:t>
+        <w:t xml:space="preserve">Add a product link: </w:t>
       </w:r>
       <w:r>
         <w:rPr>
@@ -2567,7 +2567,7 @@
           <w:color w:val="172B3A"/>
           <w:sz w:val="20"/>
         </w:rPr>
-        <w:t>Approved HTTPS links can be recorded; MIST never fetches or previews their content.</w:t>
+        <w:t>An approved HTTPS destination can be recorded instead; MIST never fetches or previews its content.</w:t>
       </w:r>
     </w:p>
     <w:p>
@@ -2581,7 +2581,7 @@
           <w:color w:val="0B2545"/>
           <w:sz w:val="20"/>
         </w:rPr>
-        <w:t xml:space="preserve">Immutability: </w:t>
+        <w:t xml:space="preserve">Submit product: </w:t>
       </w:r>
       <w:r>
         <w:rPr>
@@ -2589,7 +2589,7 @@
           <w:color w:val="172B3A"/>
           <w:sz w:val="20"/>
         </w:rPr>
-        <w:t>Manager and QC decisions bind to the exact submitted package. Any content change creates a new version.</w:t>
+        <w:t>Submission creates the review checksum. Manager and QC decisions bind to that exact version, and any later change creates a new version.</w:t>
       </w:r>
     </w:p>
     <w:p>
@@ -2651,7 +2651,7 @@
       <w:r>
         <w:drawing>
           <wp:inline xmlns:a="http://schemas.openxmlformats.org/drawingml/2006/main" xmlns:pic="http://schemas.openxmlformats.org/drawingml/2006/picture">
-            <wp:extent cx="5623560" cy="3165198"/>
+            <wp:extent cx="5623560" cy="3166064"/>
             <wp:docPr id="11" name="Picture 11" descr="OSG Team Manager package review page showing the package contents, awaiting Manager review state, checksum and author." title="Grant Hanley reviews package v1, authored by Ben Doak, against the exact immutable package checksum."/>
             <wp:cNvGraphicFramePr>
               <a:graphicFrameLocks noChangeAspect="1"/>
@@ -2660,7 +2660,7 @@
               <a:graphicData uri="http://schemas.openxmlformats.org/drawingml/2006/picture">
                 <pic:pic>
                   <pic:nvPicPr>
-                    <pic:cNvPr id="0" name="11-osg-manager-review.png"/>
+                    <pic:cNvPr id="0" name="11-osg-manager-review.jpg"/>
                     <pic:cNvPicPr/>
                   </pic:nvPicPr>
                   <pic:blipFill>
@@ -2672,7 +2672,7 @@
                   <pic:spPr>
                     <a:xfrm>
                       <a:off x="0" y="0"/>
-                      <a:ext cx="5623560" cy="3165198"/>
+                      <a:ext cx="5623560" cy="3166064"/>
                     </a:xfrm>
                     <a:prstGeom prst="rect"/>
                   </pic:spPr>
@@ -2817,7 +2817,7 @@
       <w:r>
         <w:drawing>
           <wp:inline xmlns:a="http://schemas.openxmlformats.org/drawingml/2006/main" xmlns:pic="http://schemas.openxmlformats.org/drawingml/2006/picture">
-            <wp:extent cx="5623560" cy="3165198"/>
+            <wp:extent cx="5623560" cy="3166064"/>
             <wp:docPr id="12" name="Picture 12" descr="OSG Team Workspace overview showing tabs, staffing totals, active work and Team attention signals." title="Overview, Work queue, Board, Calendar, People, Statistics and Activity are available from the same OSG Team Workspace."/>
             <wp:cNvGraphicFramePr>
               <a:graphicFrameLocks noChangeAspect="1"/>
@@ -2826,7 +2826,7 @@
               <a:graphicData uri="http://schemas.openxmlformats.org/drawingml/2006/picture">
                 <pic:pic>
                   <pic:nvPicPr>
-                    <pic:cNvPr id="0" name="12-team-workspace-overview.png"/>
+                    <pic:cNvPr id="0" name="12-team-workspace-overview.jpg"/>
                     <pic:cNvPicPr/>
                   </pic:nvPicPr>
                   <pic:blipFill>
@@ -2838,7 +2838,7 @@
                   <pic:spPr>
                     <a:xfrm>
                       <a:off x="0" y="0"/>
-                      <a:ext cx="5623560" cy="3165198"/>
+                      <a:ext cx="5623560" cy="3166064"/>
                     </a:xfrm>
                     <a:prstGeom prst="rect"/>
                   </pic:spPr>
@@ -2983,7 +2983,7 @@
       <w:r>
         <w:drawing>
           <wp:inline xmlns:a="http://schemas.openxmlformats.org/drawingml/2006/main" xmlns:pic="http://schemas.openxmlformats.org/drawingml/2006/picture">
-            <wp:extent cx="5623560" cy="3165198"/>
+            <wp:extent cx="5623560" cy="3166064"/>
             <wp:docPr id="13" name="Picture 13" descr="OSG Team Board screen showing search, Board and Table views, useful filters, owner filters and workflow lanes." title="Managers can search, filter, save views, inspect owners and expose downstream or exception lanes without dragging a service request between stages."/>
             <wp:cNvGraphicFramePr>
               <a:graphicFrameLocks noChangeAspect="1"/>
@@ -2992,7 +2992,7 @@
               <a:graphicData uri="http://schemas.openxmlformats.org/drawingml/2006/picture">
                 <pic:pic>
                   <pic:nvPicPr>
-                    <pic:cNvPr id="0" name="13-team-workspace-board.png"/>
+                    <pic:cNvPr id="0" name="13-team-workspace-board.jpg"/>
                     <pic:cNvPicPr/>
                   </pic:nvPicPr>
                   <pic:blipFill>
@@ -3004,7 +3004,7 @@
                   <pic:spPr>
                     <a:xfrm>
                       <a:off x="0" y="0"/>
-                      <a:ext cx="5623560" cy="3165198"/>
+                      <a:ext cx="5623560" cy="3166064"/>
                     </a:xfrm>
                     <a:prstGeom prst="rect"/>
                   </pic:spPr>
@@ -3149,7 +3149,7 @@
       <w:r>
         <w:drawing>
           <wp:inline xmlns:a="http://schemas.openxmlformats.org/drawingml/2006/main" xmlns:pic="http://schemas.openxmlformats.org/drawingml/2006/picture">
-            <wp:extent cx="5623560" cy="3165198"/>
+            <wp:extent cx="5623560" cy="3166064"/>
             <wp:docPr id="14" name="Picture 14" descr="QC Team workspace showing one available item under Needs QC review and none under Ready for dissemination." title="Angus Gunn sees the Northshore package waiting for QC review but leaves it unclaimed for a QC User."/>
             <wp:cNvGraphicFramePr>
               <a:graphicFrameLocks noChangeAspect="1"/>
@@ -3158,7 +3158,7 @@
               <a:graphicData uri="http://schemas.openxmlformats.org/drawingml/2006/picture">
                 <pic:pic>
                   <pic:nvPicPr>
-                    <pic:cNvPr id="0" name="14-qc-manager-oversight.png"/>
+                    <pic:cNvPr id="0" name="14-qc-manager-oversight.jpg"/>
                     <pic:cNvPicPr/>
                   </pic:nvPicPr>
                   <pic:blipFill>
@@ -3170,7 +3170,7 @@
                   <pic:spPr>
                     <a:xfrm>
                       <a:off x="0" y="0"/>
-                      <a:ext cx="5623560" cy="3165198"/>
+                      <a:ext cx="5623560" cy="3166064"/>
                     </a:xfrm>
                     <a:prstGeom prst="rect"/>
                   </pic:spPr>
@@ -3315,7 +3315,7 @@
       <w:r>
         <w:drawing>
           <wp:inline xmlns:a="http://schemas.openxmlformats.org/drawingml/2006/main" xmlns:pic="http://schemas.openxmlformats.org/drawingml/2006/picture">
-            <wp:extent cx="5623560" cy="3165198"/>
+            <wp:extent cx="5623560" cy="3166064"/>
             <wp:docPr id="15" name="Picture 15" descr="QC User package review page showing Manager approved status, exact package checksum and author Ben Doak." title="Liam Kelly performs QC review on the exact package approved by Grant Hanley."/>
             <wp:cNvGraphicFramePr>
               <a:graphicFrameLocks noChangeAspect="1"/>
@@ -3324,7 +3324,7 @@
               <a:graphicData uri="http://schemas.openxmlformats.org/drawingml/2006/picture">
                 <pic:pic>
                   <pic:nvPicPr>
-                    <pic:cNvPr id="0" name="15-qc-user-review.png"/>
+                    <pic:cNvPr id="0" name="15-qc-user-review.jpg"/>
                     <pic:cNvPicPr/>
                   </pic:nvPicPr>
                   <pic:blipFill>
@@ -3336,7 +3336,7 @@
                   <pic:spPr>
                     <a:xfrm>
                       <a:off x="0" y="0"/>
-                      <a:ext cx="5623560" cy="3165198"/>
+                      <a:ext cx="5623560" cy="3166064"/>
                     </a:xfrm>
                     <a:prstGeom prst="rect"/>
                   </pic:spPr>
@@ -3481,7 +3481,7 @@
       <w:r>
         <w:drawing>
           <wp:inline xmlns:a="http://schemas.openxmlformats.org/drawingml/2006/main" xmlns:pic="http://schemas.openxmlformats.org/drawingml/2006/picture">
-            <wp:extent cx="5623560" cy="3165198"/>
+            <wp:extent cx="5623560" cy="3166064"/>
             <wp:docPr id="16" name="Picture 16" descr="Disseminated package page under QC Manager Neil Alexander, showing Released artefact, checksum and dissemination record." title="Neil Alexander disseminates package v1 after Liam Kelly's QC review; the release record names the disseminating Manager."/>
             <wp:cNvGraphicFramePr>
               <a:graphicFrameLocks noChangeAspect="1"/>
@@ -3490,7 +3490,7 @@
               <a:graphicData uri="http://schemas.openxmlformats.org/drawingml/2006/picture">
                 <pic:pic>
                   <pic:nvPicPr>
-                    <pic:cNvPr id="0" name="16-qc-manager-dissemination.png"/>
+                    <pic:cNvPr id="0" name="16-qc-manager-dissemination.jpg"/>
                     <pic:cNvPicPr/>
                   </pic:nvPicPr>
                   <pic:blipFill>
@@ -3502,7 +3502,7 @@
                   <pic:spPr>
                     <a:xfrm>
                       <a:off x="0" y="0"/>
-                      <a:ext cx="5623560" cy="3165198"/>
+                      <a:ext cx="5623560" cy="3166064"/>
                     </a:xfrm>
                     <a:prstGeom prst="rect"/>
                   </pic:spPr>
@@ -3647,7 +3647,7 @@
       <w:r>
         <w:drawing>
           <wp:inline xmlns:a="http://schemas.openxmlformats.org/drawingml/2006/main" xmlns:pic="http://schemas.openxmlformats.org/drawingml/2006/picture">
-            <wp:extent cx="5623560" cy="3164094"/>
+            <wp:extent cx="5623560" cy="3166064"/>
             <wp:docPr id="17" name="Picture 17" descr="Customer request page showing Product available, released Northshore artefact, Accept product button and feedback section." title="The disseminated result includes the released artefact, Customer note, explicit acceptance control and feedback form."/>
             <wp:cNvGraphicFramePr>
               <a:graphicFrameLocks noChangeAspect="1"/>
@@ -3656,7 +3656,7 @@
               <a:graphicData uri="http://schemas.openxmlformats.org/drawingml/2006/picture">
                 <pic:pic>
                   <pic:nvPicPr>
-                    <pic:cNvPr id="0" name="17-customer-product-available.png"/>
+                    <pic:cNvPr id="0" name="17-customer-product-available.jpg"/>
                     <pic:cNvPicPr/>
                   </pic:nvPicPr>
                   <pic:blipFill>
@@ -3668,7 +3668,7 @@
                   <pic:spPr>
                     <a:xfrm>
                       <a:off x="0" y="0"/>
-                      <a:ext cx="5623560" cy="3164094"/>
+                      <a:ext cx="5623560" cy="3166064"/>
                     </a:xfrm>
                     <a:prstGeom prst="rect"/>
                   </pic:spPr>
@@ -3813,7 +3813,7 @@
       <w:r>
         <w:drawing>
           <wp:inline xmlns:a="http://schemas.openxmlformats.org/drawingml/2006/main" xmlns:pic="http://schemas.openxmlformats.org/drawingml/2006/picture">
-            <wp:extent cx="5623560" cy="3164094"/>
+            <wp:extent cx="5623560" cy="3166064"/>
             <wp:docPr id="18" name="Picture 18" descr="Customer product panel showing Accepted timestamp and the service feedback controls." title="John McGinn accepts the released Northshore product; the feedback experience remains available below it."/>
             <wp:cNvGraphicFramePr>
               <a:graphicFrameLocks noChangeAspect="1"/>
@@ -3822,7 +3822,7 @@
               <a:graphicData uri="http://schemas.openxmlformats.org/drawingml/2006/picture">
                 <pic:pic>
                   <pic:nvPicPr>
-                    <pic:cNvPr id="0" name="18-customer-accepted.png"/>
+                    <pic:cNvPr id="0" name="18-customer-accepted.jpg"/>
                     <pic:cNvPicPr/>
                   </pic:nvPicPr>
                   <pic:blipFill>
@@ -3834,7 +3834,7 @@
                   <pic:spPr>
                     <a:xfrm>
                       <a:off x="0" y="0"/>
-                      <a:ext cx="5623560" cy="3164094"/>
+                      <a:ext cx="5623560" cy="3166064"/>
                     </a:xfrm>
                     <a:prstGeom prst="rect"/>
                   </pic:spPr>
@@ -3979,7 +3979,7 @@
       <w:r>
         <w:drawing>
           <wp:inline xmlns:a="http://schemas.openxmlformats.org/drawingml/2006/main" xmlns:pic="http://schemas.openxmlformats.org/drawingml/2006/picture">
-            <wp:extent cx="5623560" cy="3165198"/>
+            <wp:extent cx="5623560" cy="3166064"/>
             <wp:docPr id="19" name="Picture 19" descr="Grant Hanley personal profile showing active account status, account details, representative Team Manager role and OSG Team workspace access." title="The profile makes the signed-in identity and access boundary explicit before a person begins operational work."/>
             <wp:cNvGraphicFramePr>
               <a:graphicFrameLocks noChangeAspect="1"/>
@@ -3988,7 +3988,7 @@
               <a:graphicData uri="http://schemas.openxmlformats.org/drawingml/2006/picture">
                 <pic:pic>
                   <pic:nvPicPr>
-                    <pic:cNvPr id="0" name="19-user-profile.png"/>
+                    <pic:cNvPr id="0" name="19-user-profile.jpg"/>
                     <pic:cNvPicPr/>
                   </pic:nvPicPr>
                   <pic:blipFill>
@@ -4000,7 +4000,7 @@
                   <pic:spPr>
                     <a:xfrm>
                       <a:off x="0" y="0"/>
-                      <a:ext cx="5623560" cy="3165198"/>
+                      <a:ext cx="5623560" cy="3166064"/>
                     </a:xfrm>
                     <a:prstGeom prst="rect"/>
                   </pic:spPr>
@@ -4145,7 +4145,7 @@
       <w:r>
         <w:drawing>
           <wp:inline xmlns:a="http://schemas.openxmlformats.org/drawingml/2006/main" xmlns:pic="http://schemas.openxmlformats.org/drawingml/2006/picture">
-            <wp:extent cx="5623560" cy="3163252"/>
+            <wp:extent cx="5623560" cy="3160441"/>
             <wp:docPr id="20" name="Picture 20" descr="OSG Team Manager My actions page showing work-count tiles, notifications, saved views and filters, and an explicit no-work state." title="The personal register remains distinct from the wider OSG Team workload and makes an empty result explicit rather than ambiguous."/>
             <wp:cNvGraphicFramePr>
               <a:graphicFrameLocks noChangeAspect="1"/>
@@ -4154,7 +4154,7 @@
               <a:graphicData uri="http://schemas.openxmlformats.org/drawingml/2006/picture">
                 <pic:pic>
                   <pic:nvPicPr>
-                    <pic:cNvPr id="0" name="22-my-assigned-actions.png"/>
+                    <pic:cNvPr id="0" name="22-my-assigned-actions.jpg"/>
                     <pic:cNvPicPr/>
                   </pic:nvPicPr>
                   <pic:blipFill>
@@ -4166,7 +4166,7 @@
                   <pic:spPr>
                     <a:xfrm>
                       <a:off x="0" y="0"/>
-                      <a:ext cx="5623560" cy="3163252"/>
+                      <a:ext cx="5623560" cy="3160441"/>
                     </a:xfrm>
                     <a:prstGeom prst="rect"/>
                   </pic:spPr>
@@ -4311,7 +4311,7 @@
       <w:r>
         <w:drawing>
           <wp:inline xmlns:a="http://schemas.openxmlformats.org/drawingml/2006/main" xmlns:pic="http://schemas.openxmlformats.org/drawingml/2006/picture">
-            <wp:extent cx="5623560" cy="3165198"/>
+            <wp:extent cx="5623560" cy="3166064"/>
             <wp:docPr id="21" name="Picture 21" descr="Grant Hanley personal calendar in month view for August 2026, with Today, Add event, Month, Week and Agenda controls and a link to the OSG Team calendar." title="Personal events also appear in the current team calendar, while private appointments reveal only Busy and the time to colleagues."/>
             <wp:cNvGraphicFramePr>
               <a:graphicFrameLocks noChangeAspect="1"/>
@@ -4320,7 +4320,7 @@
               <a:graphicData uri="http://schemas.openxmlformats.org/drawingml/2006/picture">
                 <pic:pic>
                   <pic:nvPicPr>
-                    <pic:cNvPr id="0" name="20-personal-calendar.png"/>
+                    <pic:cNvPr id="0" name="20-personal-calendar.jpg"/>
                     <pic:cNvPicPr/>
                   </pic:nvPicPr>
                   <pic:blipFill>
@@ -4332,7 +4332,7 @@
                   <pic:spPr>
                     <a:xfrm>
                       <a:off x="0" y="0"/>
-                      <a:ext cx="5623560" cy="3165198"/>
+                      <a:ext cx="5623560" cy="3166064"/>
                     </a:xfrm>
                     <a:prstGeom prst="rect"/>
                   </pic:spPr>
@@ -4477,7 +4477,7 @@
       <w:r>
         <w:drawing>
           <wp:inline xmlns:a="http://schemas.openxmlformats.org/drawingml/2006/main" xmlns:pic="http://schemas.openxmlformats.org/drawingml/2006/picture">
-            <wp:extent cx="5623560" cy="3165198"/>
+            <wp:extent cx="5623560" cy="3166064"/>
             <wp:docPr id="22" name="Picture 22" descr="OSG Team Workspace Calendar tab in month view for August 2026, showing the workspace navigation and calendar controls." title="Managers and Members see one team calendar without losing the ownership and privacy rules of the underlying personal events."/>
             <wp:cNvGraphicFramePr>
               <a:graphicFrameLocks noChangeAspect="1"/>
@@ -4486,7 +4486,7 @@
               <a:graphicData uri="http://schemas.openxmlformats.org/drawingml/2006/picture">
                 <pic:pic>
                   <pic:nvPicPr>
-                    <pic:cNvPr id="0" name="21-team-calendar.png"/>
+                    <pic:cNvPr id="0" name="21-team-calendar.jpg"/>
                     <pic:cNvPicPr/>
                   </pic:nvPicPr>
                   <pic:blipFill>
@@ -4498,7 +4498,7 @@
                   <pic:spPr>
                     <a:xfrm>
                       <a:off x="0" y="0"/>
-                      <a:ext cx="5623560" cy="3165198"/>
+                      <a:ext cx="5623560" cy="3166064"/>
                     </a:xfrm>
                     <a:prstGeom prst="rect"/>
                   </pic:spPr>
@@ -4643,7 +4643,7 @@
       <w:r>
         <w:drawing>
           <wp:inline xmlns:a="http://schemas.openxmlformats.org/drawingml/2006/main" xmlns:pic="http://schemas.openxmlformats.org/drawingml/2006/picture">
-            <wp:extent cx="5623560" cy="3165198"/>
+            <wp:extent cx="5623560" cy="3166064"/>
             <wp:docPr id="23" name="Picture 23" descr="OSG Team Workspace People tab showing current Managers in the effective membership table and Manager controls for adding or transferring Members." title="Current, scheduled and ended membership records remain visible as history, while roster changes require a named Manager action and reason."/>
             <wp:cNvGraphicFramePr>
               <a:graphicFrameLocks noChangeAspect="1"/>
@@ -4652,7 +4652,7 @@
               <a:graphicData uri="http://schemas.openxmlformats.org/drawingml/2006/picture">
                 <pic:pic>
                   <pic:nvPicPr>
-                    <pic:cNvPr id="0" name="23-team-workspace-people.png"/>
+                    <pic:cNvPr id="0" name="23-team-workspace-people.jpg"/>
                     <pic:cNvPicPr/>
                   </pic:nvPicPr>
                   <pic:blipFill>
@@ -4664,7 +4664,7 @@
                   <pic:spPr>
                     <a:xfrm>
                       <a:off x="0" y="0"/>
-                      <a:ext cx="5623560" cy="3165198"/>
+                      <a:ext cx="5623560" cy="3166064"/>
                     </a:xfrm>
                     <a:prstGeom prst="rect"/>
                   </pic:spPr>

</xml_diff>